<commit_message>
BCMOHAM-30387- Update Doc gen template
</commit_message>
<xml_diff>
--- a/ALR-DocgenTemplates/Late Fee Invoice Template.docx
+++ b/ALR-DocgenTemplates/Late Fee Invoice Template.docx
@@ -136,29 +136,7 @@
                 <w:szCs w:val="24"/>
                 <w14:ligatures w14:val="none"/>
               </w:rPr>
-              <w:t>{{</w:t>
-            </w:r>
-            <w:proofErr w:type="spellStart"/>
-            <w:r>
-              <w:rPr>
-                <w:color w:val="000000" w:themeColor="text1"/>
-                <w:kern w:val="0"/>
-                <w:sz w:val="24"/>
-                <w:szCs w:val="24"/>
-                <w14:ligatures w14:val="none"/>
-              </w:rPr>
-              <w:t>RegistrantName</w:t>
-            </w:r>
-            <w:proofErr w:type="spellEnd"/>
-            <w:r>
-              <w:rPr>
-                <w:color w:val="000000" w:themeColor="text1"/>
-                <w:kern w:val="0"/>
-                <w:sz w:val="24"/>
-                <w:szCs w:val="24"/>
-                <w14:ligatures w14:val="none"/>
-              </w:rPr>
-              <w:t>}}</w:t>
+              <w:t>{{RegistrantName}}</w:t>
             </w:r>
           </w:p>
         </w:tc>
@@ -183,29 +161,7 @@
                 <w:szCs w:val="24"/>
                 <w14:ligatures w14:val="none"/>
               </w:rPr>
-              <w:t>{{</w:t>
-            </w:r>
-            <w:proofErr w:type="spellStart"/>
-            <w:r>
-              <w:rPr>
-                <w:color w:val="000000" w:themeColor="text1"/>
-                <w:kern w:val="0"/>
-                <w:sz w:val="24"/>
-                <w:szCs w:val="24"/>
-                <w14:ligatures w14:val="none"/>
-              </w:rPr>
-              <w:t>ResidenceName</w:t>
-            </w:r>
-            <w:proofErr w:type="spellEnd"/>
-            <w:r>
-              <w:rPr>
-                <w:color w:val="000000" w:themeColor="text1"/>
-                <w:kern w:val="0"/>
-                <w:sz w:val="24"/>
-                <w:szCs w:val="24"/>
-                <w14:ligatures w14:val="none"/>
-              </w:rPr>
-              <w:t>}}</w:t>
+              <w:t>{{ResidenceName}}</w:t>
             </w:r>
           </w:p>
         </w:tc>
@@ -235,29 +191,7 @@
                 <w:szCs w:val="24"/>
                 <w14:ligatures w14:val="none"/>
               </w:rPr>
-              <w:t>{{</w:t>
-            </w:r>
-            <w:proofErr w:type="spellStart"/>
-            <w:r>
-              <w:rPr>
-                <w:color w:val="000000" w:themeColor="text1"/>
-                <w:kern w:val="0"/>
-                <w:sz w:val="24"/>
-                <w:szCs w:val="24"/>
-                <w14:ligatures w14:val="none"/>
-              </w:rPr>
-              <w:t>RegistrantAddress</w:t>
-            </w:r>
-            <w:proofErr w:type="spellEnd"/>
-            <w:r>
-              <w:rPr>
-                <w:color w:val="000000" w:themeColor="text1"/>
-                <w:kern w:val="0"/>
-                <w:sz w:val="24"/>
-                <w:szCs w:val="24"/>
-                <w14:ligatures w14:val="none"/>
-              </w:rPr>
-              <w:t>}}</w:t>
+              <w:t>{{RegistrantAddress}}</w:t>
             </w:r>
           </w:p>
         </w:tc>
@@ -360,25 +294,7 @@
                 <w:sz w:val="24"/>
                 <w:szCs w:val="24"/>
               </w:rPr>
-              <w:t>{{</w:t>
-            </w:r>
-            <w:proofErr w:type="spellStart"/>
-            <w:r>
-              <w:rPr>
-                <w:color w:val="000000" w:themeColor="text1"/>
-                <w:sz w:val="24"/>
-                <w:szCs w:val="24"/>
-              </w:rPr>
-              <w:t>ResidenceAddress</w:t>
-            </w:r>
-            <w:proofErr w:type="spellEnd"/>
-            <w:r>
-              <w:rPr>
-                <w:color w:val="000000" w:themeColor="text1"/>
-                <w:sz w:val="24"/>
-                <w:szCs w:val="24"/>
-              </w:rPr>
-              <w:t>}}</w:t>
+              <w:t>{{ResidenceAddress}}</w:t>
             </w:r>
             <w:bookmarkEnd w:id="1"/>
           </w:p>
@@ -635,7 +551,6 @@
                 <w:sz w:val="22"/>
               </w:rPr>
             </w:pPr>
-            <w:proofErr w:type="gramStart"/>
             <w:r>
               <w:rPr>
                 <w:rStyle w:val="ui-provider"/>
@@ -656,8 +571,6 @@
               <w:t>{{/</w:t>
             </w:r>
             <w:bookmarkStart w:id="6" w:name="OLE_LINK6"/>
-            <w:proofErr w:type="spellStart"/>
-            <w:proofErr w:type="gramEnd"/>
             <w:r>
               <w:rPr>
                 <w:rStyle w:val="ui-provider"/>
@@ -676,7 +589,6 @@
               <w:t>nvoiceItem</w:t>
             </w:r>
             <w:bookmarkEnd w:id="6"/>
-            <w:proofErr w:type="spellEnd"/>
             <w:r>
               <w:rPr>
                 <w:rStyle w:val="ui-provider"/>
@@ -1051,7 +963,6 @@
               </w:rPr>
               <w:t xml:space="preserve"> </w:t>
             </w:r>
-            <w:proofErr w:type="gramStart"/>
             <w:r>
               <w:rPr>
                 <w:b/>
@@ -1069,26 +980,7 @@
                 <w:sz w:val="24"/>
                 <w:szCs w:val="24"/>
               </w:rPr>
-              <w:t>{{</w:t>
-            </w:r>
-            <w:proofErr w:type="spellStart"/>
-            <w:proofErr w:type="gramEnd"/>
-            <w:r>
-              <w:rPr>
-                <w:color w:val="000000" w:themeColor="text1"/>
-                <w:sz w:val="24"/>
-                <w:szCs w:val="24"/>
-              </w:rPr>
-              <w:t>CertificateId</w:t>
-            </w:r>
-            <w:proofErr w:type="spellEnd"/>
-            <w:r>
-              <w:rPr>
-                <w:color w:val="000000" w:themeColor="text1"/>
-                <w:sz w:val="24"/>
-                <w:szCs w:val="24"/>
-              </w:rPr>
-              <w:t>}}</w:t>
+              <w:t>{{CertificateId}}</w:t>
             </w:r>
             <w:bookmarkEnd w:id="7"/>
           </w:p>
@@ -1137,29 +1029,7 @@
                 <w:szCs w:val="24"/>
                 <w14:ligatures w14:val="none"/>
               </w:rPr>
-              <w:t>{{</w:t>
-            </w:r>
-            <w:proofErr w:type="spellStart"/>
-            <w:r>
-              <w:rPr>
-                <w:color w:val="000000" w:themeColor="text1"/>
-                <w:kern w:val="0"/>
-                <w:sz w:val="24"/>
-                <w:szCs w:val="24"/>
-                <w14:ligatures w14:val="none"/>
-              </w:rPr>
-              <w:t>TotalFeeAmount</w:t>
-            </w:r>
-            <w:proofErr w:type="spellEnd"/>
-            <w:r>
-              <w:rPr>
-                <w:color w:val="000000" w:themeColor="text1"/>
-                <w:kern w:val="0"/>
-                <w:sz w:val="24"/>
-                <w:szCs w:val="24"/>
-                <w14:ligatures w14:val="none"/>
-              </w:rPr>
-              <w:t>}}</w:t>
+              <w:t>{{TotalFeeAmount}}</w:t>
             </w:r>
             <w:bookmarkEnd w:id="8"/>
           </w:p>
@@ -1663,27 +1533,7 @@
         <w:sz w:val="28"/>
         <w:szCs w:val="28"/>
       </w:rPr>
-      <w:t>{{</w:t>
-    </w:r>
-    <w:proofErr w:type="spellStart"/>
-    <w:r>
-      <w:rPr>
-        <w:b/>
-        <w:bCs/>
-        <w:sz w:val="28"/>
-        <w:szCs w:val="28"/>
-      </w:rPr>
-      <w:t>InvoiceId</w:t>
-    </w:r>
-    <w:proofErr w:type="spellEnd"/>
-    <w:r>
-      <w:rPr>
-        <w:b/>
-        <w:bCs/>
-        <w:sz w:val="28"/>
-        <w:szCs w:val="28"/>
-      </w:rPr>
-      <w:t>}}</w:t>
+      <w:t>{{InvoiceId}}</w:t>
     </w:r>
     <w:r>
       <w:rPr>
@@ -1767,25 +1617,7 @@
         <w:szCs w:val="20"/>
         <w14:ligatures w14:val="none"/>
       </w:rPr>
-      <w:t>{{</w:t>
-    </w:r>
-    <w:proofErr w:type="spellStart"/>
-    <w:r>
-      <w:rPr>
-        <w:kern w:val="0"/>
-        <w:szCs w:val="20"/>
-        <w14:ligatures w14:val="none"/>
-      </w:rPr>
-      <w:t>InvoiceCreatedDate</w:t>
-    </w:r>
-    <w:proofErr w:type="spellEnd"/>
-    <w:r>
-      <w:rPr>
-        <w:kern w:val="0"/>
-        <w:szCs w:val="20"/>
-        <w14:ligatures w14:val="none"/>
-      </w:rPr>
-      <w:t>}}</w:t>
+      <w:t>{{InvoiceCreatedDate}}</w:t>
     </w:r>
     <w:r>
       <w:rPr>
@@ -1818,7 +1650,21 @@
         <w:noProof/>
         <w:szCs w:val="20"/>
       </w:rPr>
-      <w:t>PO Box 9601 STN Prov Gov</w:t>
+      <w:t>PO Box 960</w:t>
+    </w:r>
+    <w:r>
+      <w:rPr>
+        <w:noProof/>
+        <w:szCs w:val="20"/>
+      </w:rPr>
+      <w:t>4</w:t>
+    </w:r>
+    <w:r>
+      <w:rPr>
+        <w:noProof/>
+        <w:szCs w:val="20"/>
+      </w:rPr>
+      <w:t xml:space="preserve"> STN Prov Gov</w:t>
     </w:r>
     <w:r>
       <w:rPr>

</xml_diff>